<commit_message>
docs: One Pager, caso de uso do Stratos e o login do Guia em dia
Os números que tinham ficado para trás nos documentos de negócio:
- One Pager: 209 testes automatizados (eram 204 em 21/10) e 38 leiautes da
  B3/CETIP — os 47 templates do File Interpreter incluem 9 da Intrag, que são
  instruções ao administrador do fundo, não leiaute da B3.
- Caso de uso do Stratos: 48 cadastros do /mapping (o swap-cetes-leg entrou
  em 21/10); o aviso de recompra saiu das caixas do Outlook (desde 20/10 a
  recompra vem da API, §640); e as fontes de mercado que o app chama hoje
  (PTAX e CDI do BACEN, IPCA do IBGE, SOFR do NY Fed, Yahoo Finance) entram
  na lista de integrações.
- Guia do Usuário: a captura do login foi refeita em 20/10 com a coluna da
  foto vazia — o defeito que o 527c3325 corrigiu. Recapturada e .docx regerado.

Co-Authored-By: Claude Opus 5.5 (1M context) <noreply@anthropic.com>
</commit_message>
<xml_diff>
--- a/Docs/OTC_Tracker_Stratos_Use_Case.docx
+++ b/Docs/OTC_Tracker_Stratos_Use_Case.docx
@@ -364,7 +364,7 @@
         <w:rPr>
           <w:b w:val="0"/>
         </w:rPr>
-        <w:t>47 reference mappings (currencies, B3 accounts, legal entities, IR exemptions, validation rules) are maintained through the application screens instead of code or spreadsheets. Every change is effective immediately and traceable.</w:t>
+        <w:t>48 reference mappings (currencies, B3 accounts, legal entities, IR exemptions, validation rules) are maintained through the application screens instead of code or spreadsheets. Every change is effective immediately and traceable.</w:t>
       </w:r>
     </w:p>
     <w:p>
@@ -553,7 +553,7 @@
         <w:rPr>
           <w:b w:val="0"/>
         </w:rPr>
-        <w:t>Existing integrations: Athena (API with Kerberos SSO), Outlook mailboxes (booking recaps, unwind notices, FepWeb D-4 report), SMTP, BACEN PTAX and the network share used for the Electronic Inventory.</w:t>
+        <w:t>Existing integrations: Athena (API with Kerberos SSO), Outlook mailboxes (booking recaps, FepWeb D-4 report), SMTP, market data sources (BACEN PTAX and CDI, IBGE IPCA, NY Fed SOFR, Yahoo Finance quotes) and the network share used for the Electronic Inventory.</w:t>
       </w:r>
     </w:p>
     <w:p>

</xml_diff>